<commit_message>
Adopt free basic participation and publish CEO status report
</commit_message>
<xml_diff>
--- a/docs/village-rewards-retailer-brief.docx
+++ b/docs/village-rewards-retailer-brief.docx
@@ -156,7 +156,7 @@
         <w:rPr>
           <w:rFonts w:ascii="Arial" w:hAnsi="Arial"/>
         </w:rPr>
-        <w:t>These retailer tools are part of the proposed package. Available features and the setup process will be demonstrated before you commit to paid participation.</w:t>
+        <w:t>Enhanced retailer tools may be offered separately in future. Any paid features will be optional, demonstrated and clearly priced before you choose them.</w:t>
       </w:r>
     </w:p>
     <w:p>
@@ -175,7 +175,7 @@
         <w:rPr>
           <w:rFonts w:ascii="Arial" w:hAnsi="Arial"/>
         </w:rPr>
-        <w:t>What the retailer package is designed to provide</w:t>
+        <w:t>What retailers can access</w:t>
       </w:r>
     </w:p>
     <w:p>
@@ -208,7 +208,7 @@
         <w:rPr>
           <w:rFonts w:ascii="Arial" w:hAnsi="Arial"/>
         </w:rPr>
-        <w:t>Optional digital loyalty cards and promotions that you control.</w:t>
+        <w:t>Potential optional extras: enhanced digital loyalty cards and promotion tools that you control.</w:t>
       </w:r>
     </w:p>
     <w:p>
@@ -219,7 +219,7 @@
         <w:rPr>
           <w:rFonts w:ascii="Arial" w:hAnsi="Arial"/>
         </w:rPr>
-        <w:t>Simple reporting on recorded customer visits, repeat use and reward redemptions.</w:t>
+        <w:t>Potential optional extras: enhanced reporting on recorded visits, repeat use and redemptions.</w:t>
       </w:r>
     </w:p>
     <w:p>
@@ -241,7 +241,7 @@
         <w:rPr>
           <w:rFonts w:ascii="Arial" w:hAnsi="Arial"/>
         </w:rPr>
-        <w:t>The founding pilot and price</w:t>
+        <w:t>Free participation and the pilot</w:t>
       </w:r>
     </w:p>
     <w:p>
@@ -250,7 +250,7 @@
         <w:rPr>
           <w:rFonts w:ascii="Arial" w:hAnsi="Arial"/>
         </w:rPr>
-        <w:t>The founding pilot is free for 90 days. The proposed ongoing subscription is A$30 per month per business, with no transaction fee or percentage of sales.</w:t>
+        <w:t>The founding pilot runs for 90 days. Basic participation is free during and after the pilot, with no automatic subscription, transaction fees or percentage of sales.</w:t>
       </w:r>
     </w:p>
     <w:p>
@@ -259,7 +259,7 @@
         <w:rPr>
           <w:rFonts w:ascii="Arial" w:hAnsi="Arial"/>
         </w:rPr>
-        <w:t>The subscription pays for the service. Any reward you choose to offer is an additional promotional cost to your business. Billing dates, GST treatment, cancellation terms and the included features will be confirmed before paid participation.</w:t>
+        <w:t>We are seeking association or sponsor support to operate the shared service; funding is still to be agreed. Any reward you choose to offer remains your own promotional cost. Future enhanced tools may be offered at an optional price, with clear terms before you opt in.</w:t>
       </w:r>
     </w:p>
     <w:p>
@@ -288,7 +288,7 @@
         <w:rPr>
           <w:rFonts w:ascii="Arial" w:hAnsi="Arial"/>
         </w:rPr>
-        <w:t>A proposed launch challenge invites customers to purchase at six different participating businesses to enter a prize draw. MAVBA is being asked to support the prize. The campaign will only be announced once funding, dates and terms are agreed.</w:t>
+        <w:t>A proposed launch challenge invites customers to purchase at six different participating businesses to enter a prize draw. MAVBA or sponsors may support the prize alongside operating funding. The campaign will only be announced once funding, dates and terms are agreed.</w:t>
       </w:r>
     </w:p>
     <w:p>

</xml_diff>